<commit_message>
Umgebung und Bildschirm zusammengefügt mit dem Rest des Codes
</commit_message>
<xml_diff>
--- a/Diplomarbeit Projektbeschreibung.docx
+++ b/Diplomarbeit Projektbeschreibung.docx
@@ -1,6 +1,6 @@
 
 <file path=word/document.xml><?xml version="1.0" encoding="utf-8"?>
-<w:document xmlns:wpc="http://schemas.microsoft.com/office/word/2010/wordprocessingCanvas" xmlns:cx="http://schemas.microsoft.com/office/drawing/2014/chartex" xmlns:cx1="http://schemas.microsoft.com/office/drawing/2015/9/8/chartex" xmlns:cx2="http://schemas.microsoft.com/office/drawing/2015/10/21/chartex" xmlns:cx3="http://schemas.microsoft.com/office/drawing/2016/5/9/chartex" xmlns:cx4="http://schemas.microsoft.com/office/drawing/2016/5/10/chartex" xmlns:cx5="http://schemas.microsoft.com/office/drawing/2016/5/11/chartex" xmlns:cx6="http://schemas.microsoft.com/office/drawing/2016/5/12/chartex" xmlns:cx7="http://schemas.microsoft.com/office/drawing/2016/5/13/chartex" xmlns:cx8="http://schemas.microsoft.com/office/drawing/2016/5/14/chartex" xmlns:mc="http://schemas.openxmlformats.org/markup-compatibility/2006" xmlns:aink="http://schemas.microsoft.com/office/drawing/2016/ink" xmlns:am3d="http://schemas.microsoft.com/office/drawing/2017/model3d" xmlns:o="urn:schemas-microsoft-com:office:office" xmlns:oel="http://schemas.microsoft.com/office/2019/extlst" xmlns:r="http://schemas.openxmlformats.org/officeDocument/2006/relationships" xmlns:m="http://schemas.openxmlformats.org/officeDocument/2006/math" xmlns:v="urn:schemas-microsoft-com:vml" xmlns:wp14="http://schemas.microsoft.com/office/word/2010/wordprocessingDrawing" xmlns:wp="http://schemas.openxmlformats.org/drawingml/2006/wordprocessingDrawing" xmlns:w10="urn:schemas-microsoft-com:office:word" xmlns:w="http://schemas.openxmlformats.org/wordprocessingml/2006/main" xmlns:w14="http://schemas.microsoft.com/office/word/2010/wordml" xmlns:w15="http://schemas.microsoft.com/office/word/2012/wordml" xmlns:w16cex="http://schemas.microsoft.com/office/word/2018/wordml/cex" xmlns:w16cid="http://schemas.microsoft.com/office/word/2016/wordml/cid" xmlns:w16="http://schemas.microsoft.com/office/word/2018/wordml" xmlns:w16sdtdh="http://schemas.microsoft.com/office/word/2020/wordml/sdtdatahash" xmlns:w16se="http://schemas.microsoft.com/office/word/2015/wordml/symex" xmlns:wpg="http://schemas.microsoft.com/office/word/2010/wordprocessingGroup" xmlns:wpi="http://schemas.microsoft.com/office/word/2010/wordprocessingInk" xmlns:wne="http://schemas.microsoft.com/office/word/2006/wordml" xmlns:wps="http://schemas.microsoft.com/office/word/2010/wordprocessingShape" mc:Ignorable="w14 w15 w16se w16cid w16 w16cex w16sdtdh wp14">
+<w:document xmlns:wpc="http://schemas.microsoft.com/office/word/2010/wordprocessingCanvas" xmlns:cx="http://schemas.microsoft.com/office/drawing/2014/chartex" xmlns:cx1="http://schemas.microsoft.com/office/drawing/2015/9/8/chartex" xmlns:cx2="http://schemas.microsoft.com/office/drawing/2015/10/21/chartex" xmlns:cx3="http://schemas.microsoft.com/office/drawing/2016/5/9/chartex" xmlns:cx4="http://schemas.microsoft.com/office/drawing/2016/5/10/chartex" xmlns:cx5="http://schemas.microsoft.com/office/drawing/2016/5/11/chartex" xmlns:cx6="http://schemas.microsoft.com/office/drawing/2016/5/12/chartex" xmlns:cx7="http://schemas.microsoft.com/office/drawing/2016/5/13/chartex" xmlns:cx8="http://schemas.microsoft.com/office/drawing/2016/5/14/chartex" xmlns:mc="http://schemas.openxmlformats.org/markup-compatibility/2006" xmlns:aink="http://schemas.microsoft.com/office/drawing/2016/ink" xmlns:am3d="http://schemas.microsoft.com/office/drawing/2017/model3d" xmlns:o="urn:schemas-microsoft-com:office:office" xmlns:oel="http://schemas.microsoft.com/office/2019/extlst" xmlns:r="http://schemas.openxmlformats.org/officeDocument/2006/relationships" xmlns:m="http://schemas.openxmlformats.org/officeDocument/2006/math" xmlns:v="urn:schemas-microsoft-com:vml" xmlns:wp14="http://schemas.microsoft.com/office/word/2010/wordprocessingDrawing" xmlns:wp="http://schemas.openxmlformats.org/drawingml/2006/wordprocessingDrawing" xmlns:w10="urn:schemas-microsoft-com:office:word" xmlns:w="http://schemas.openxmlformats.org/wordprocessingml/2006/main" xmlns:w14="http://schemas.microsoft.com/office/word/2010/wordml" xmlns:w15="http://schemas.microsoft.com/office/word/2012/wordml" xmlns:w16cex="http://schemas.microsoft.com/office/word/2018/wordml/cex" xmlns:w16cid="http://schemas.microsoft.com/office/word/2016/wordml/cid" xmlns:w16="http://schemas.microsoft.com/office/word/2018/wordml" xmlns:w16du="http://schemas.microsoft.com/office/word/2023/wordml/word16du" xmlns:w16sdtdh="http://schemas.microsoft.com/office/word/2020/wordml/sdtdatahash" xmlns:w16se="http://schemas.microsoft.com/office/word/2015/wordml/symex" xmlns:wpg="http://schemas.microsoft.com/office/word/2010/wordprocessingGroup" xmlns:wpi="http://schemas.microsoft.com/office/word/2010/wordprocessingInk" xmlns:wne="http://schemas.microsoft.com/office/word/2006/wordml" xmlns:wps="http://schemas.microsoft.com/office/word/2010/wordprocessingShape" mc:Ignorable="w14 w15 w16se w16cid w16 w16cex w16sdtdh w16du wp14">
   <w:body>
     <w:p>
       <w:pPr>
@@ -278,24 +278,6 @@
         <w:rPr>
           <w:lang w:val="de-DE"/>
         </w:rPr>
-        <w:t>Ultraschallsensor</w:t>
-      </w:r>
-    </w:p>
-    <w:p>
-      <w:pPr>
-        <w:pStyle w:val="Listenabsatz"/>
-        <w:numPr>
-          <w:ilvl w:val="1"/>
-          <w:numId w:val="1"/>
-        </w:numPr>
-        <w:rPr>
-          <w:lang w:val="de-DE"/>
-        </w:rPr>
-      </w:pPr>
-      <w:r>
-        <w:rPr>
-          <w:lang w:val="de-DE"/>
-        </w:rPr>
         <w:t>4 Räder mit 4 Motoren</w:t>
       </w:r>
     </w:p>
@@ -308,6 +290,8 @@
         </w:numPr>
         <w:ind w:left="284" w:hanging="357"/>
         <w:rPr>
+          <w:b/>
+          <w:bCs/>
           <w:lang w:val="de-DE"/>
         </w:rPr>
       </w:pPr>
@@ -316,6 +300,72 @@
           <w:lang w:val="de-DE"/>
         </w:rPr>
         <w:t>Das Fahrzeug ist mit einem 360-Grad-Laser-Entfernungssensor ausgestattet, der seine Umgebung erkennt, insbesondere stationäre Elemente wie Wände.</w:t>
+      </w:r>
+    </w:p>
+    <w:p>
+      <w:pPr>
+        <w:ind w:left="-73"/>
+        <w:rPr>
+          <w:b/>
+          <w:bCs/>
+          <w:lang w:val="de-DE"/>
+        </w:rPr>
+      </w:pPr>
+      <w:r>
+        <w:rPr>
+          <w:b/>
+          <w:bCs/>
+          <w:lang w:val="de-DE"/>
+        </w:rPr>
+        <w:t>Controller und</w:t>
+      </w:r>
+      <w:r>
+        <w:rPr>
+          <w:b/>
+          <w:bCs/>
+          <w:lang w:val="de-DE"/>
+        </w:rPr>
+        <w:t xml:space="preserve"> </w:t>
+      </w:r>
+      <w:r>
+        <w:rPr>
+          <w:b/>
+          <w:bCs/>
+          <w:lang w:val="de-DE"/>
+        </w:rPr>
+        <w:t>„</w:t>
+      </w:r>
+      <w:r>
+        <w:rPr>
+          <w:b/>
+          <w:bCs/>
+          <w:lang w:val="de-DE"/>
+        </w:rPr>
+        <w:t>Home</w:t>
+      </w:r>
+      <w:r>
+        <w:rPr>
+          <w:b/>
+          <w:bCs/>
+          <w:lang w:val="de-DE"/>
+        </w:rPr>
+        <w:t>“</w:t>
+      </w:r>
+      <w:r>
+        <w:rPr>
+          <w:b/>
+          <w:bCs/>
+          <w:lang w:val="de-DE"/>
+        </w:rPr>
+        <w:t>-Funktion</w:t>
+      </w:r>
+      <w:r>
+        <w:rPr>
+          <w:b/>
+          <w:bCs/>
+          <w:lang w:val="de-DE"/>
+        </w:rPr>
+        <w:t>:</w:t>
       </w:r>
     </w:p>
     <w:p>
@@ -334,13 +384,61 @@
         <w:rPr>
           <w:lang w:val="de-DE"/>
         </w:rPr>
-        <w:t>Ein normaler Entfernungssensor</w:t>
-      </w:r>
-      <w:r>
-        <w:rPr>
-          <w:lang w:val="de-DE"/>
-        </w:rPr>
-        <w:t xml:space="preserve"> </w:t>
+        <w:t xml:space="preserve">Der Controller ist mit </w:t>
+      </w:r>
+      <w:r>
+        <w:rPr>
+          <w:lang w:val="de-DE"/>
+        </w:rPr>
+        <w:t xml:space="preserve">Folgendem </w:t>
+      </w:r>
+      <w:r>
+        <w:rPr>
+          <w:lang w:val="de-DE"/>
+        </w:rPr>
+        <w:t>ausgestattet</w:t>
+      </w:r>
+      <w:r>
+        <w:rPr>
+          <w:lang w:val="de-DE"/>
+        </w:rPr>
+        <w:t>:</w:t>
+      </w:r>
+    </w:p>
+    <w:p>
+      <w:pPr>
+        <w:pStyle w:val="Listenabsatz"/>
+        <w:numPr>
+          <w:ilvl w:val="1"/>
+          <w:numId w:val="1"/>
+        </w:numPr>
+        <w:rPr>
+          <w:lang w:val="de-DE"/>
+        </w:rPr>
+      </w:pPr>
+      <w:r>
+        <w:rPr>
+          <w:lang w:val="de-DE"/>
+        </w:rPr>
+        <w:t>Arduino</w:t>
+      </w:r>
+    </w:p>
+    <w:p>
+      <w:pPr>
+        <w:pStyle w:val="Listenabsatz"/>
+        <w:numPr>
+          <w:ilvl w:val="1"/>
+          <w:numId w:val="1"/>
+        </w:numPr>
+        <w:rPr>
+          <w:lang w:val="de-DE"/>
+        </w:rPr>
+      </w:pPr>
+      <w:r>
+        <w:rPr>
+          <w:lang w:val="de-DE"/>
+        </w:rPr>
+        <w:t xml:space="preserve">Joystick </w:t>
       </w:r>
       <w:r>
         <w:rPr>
@@ -348,7 +446,7 @@
           <w:szCs w:val="20"/>
           <w:lang w:val="de-DE"/>
         </w:rPr>
-        <w:t>(Ultraschallsensor)</w:t>
+        <w:t>(</w:t>
       </w:r>
       <w:r>
         <w:rPr>
@@ -356,32 +454,161 @@
           <w:szCs w:val="20"/>
           <w:lang w:val="de-DE"/>
         </w:rPr>
+        <w:t>zur Navigation des Fahrzeugs</w:t>
+      </w:r>
+      <w:r>
+        <w:rPr>
+          <w:sz w:val="20"/>
+          <w:szCs w:val="20"/>
+          <w:lang w:val="de-DE"/>
+        </w:rPr>
+        <w:t>)</w:t>
+      </w:r>
+    </w:p>
+    <w:p>
+      <w:pPr>
+        <w:pStyle w:val="Listenabsatz"/>
+        <w:numPr>
+          <w:ilvl w:val="1"/>
+          <w:numId w:val="1"/>
+        </w:numPr>
+        <w:rPr>
+          <w:lang w:val="de-DE"/>
+        </w:rPr>
+      </w:pPr>
+      <w:r>
+        <w:rPr>
+          <w:lang w:val="de-DE"/>
+        </w:rPr>
+        <w:t>Taste</w:t>
+      </w:r>
+      <w:r>
+        <w:rPr>
+          <w:lang w:val="de-DE"/>
+        </w:rPr>
+        <w:t>r</w:t>
+      </w:r>
+    </w:p>
+    <w:p>
+      <w:pPr>
+        <w:pStyle w:val="Listenabsatz"/>
+        <w:numPr>
+          <w:ilvl w:val="1"/>
+          <w:numId w:val="1"/>
+        </w:numPr>
+        <w:rPr>
+          <w:lang w:val="de-DE"/>
+        </w:rPr>
+      </w:pPr>
+      <w:r>
+        <w:rPr>
+          <w:lang w:val="de-DE"/>
+        </w:rPr>
+        <w:t>L</w:t>
+      </w:r>
+      <w:r>
+        <w:rPr>
+          <w:lang w:val="de-DE"/>
+        </w:rPr>
+        <w:t>E</w:t>
+      </w:r>
+      <w:r>
+        <w:rPr>
+          <w:lang w:val="de-DE"/>
+        </w:rPr>
+        <w:t>D-Bildschirm</w:t>
+      </w:r>
+    </w:p>
+    <w:p>
+      <w:pPr>
+        <w:pStyle w:val="Listenabsatz"/>
+        <w:numPr>
+          <w:ilvl w:val="0"/>
+          <w:numId w:val="1"/>
+        </w:numPr>
+        <w:ind w:left="284" w:hanging="357"/>
+        <w:rPr>
+          <w:lang w:val="de-DE"/>
+        </w:rPr>
+      </w:pPr>
+      <w:r>
+        <w:rPr>
+          <w:lang w:val="de-DE"/>
+        </w:rPr>
+        <w:t>Während des Rückkehrvorgangs</w:t>
+      </w:r>
+      <w:r>
+        <w:rPr>
+          <w:lang w:val="de-DE"/>
+        </w:rPr>
         <w:t xml:space="preserve"> </w:t>
       </w:r>
       <w:r>
         <w:rPr>
           <w:lang w:val="de-DE"/>
         </w:rPr>
-        <w:t xml:space="preserve">befindet sich </w:t>
-      </w:r>
-      <w:r>
-        <w:rPr>
-          <w:u w:val="single"/>
-          <w:lang w:val="de-DE"/>
-        </w:rPr>
-        <w:t>vorne unten am Fahrzeug</w:t>
-      </w:r>
-      <w:r>
-        <w:rPr>
-          <w:lang w:val="de-DE"/>
-        </w:rPr>
-        <w:t>, um Objekte direkt vor dem Fahrzeug zu erkennen</w:t>
-      </w:r>
-      <w:r>
-        <w:rPr>
-          <w:lang w:val="de-DE"/>
-        </w:rPr>
-        <w:t>.</w:t>
+        <w:t xml:space="preserve">wird auf dem Controller-Bildschirm die </w:t>
+      </w:r>
+      <w:r>
+        <w:rPr>
+          <w:lang w:val="de-DE"/>
+        </w:rPr>
+        <w:t>Fahrtrichtung zu</w:t>
+      </w:r>
+      <w:r>
+        <w:rPr>
+          <w:lang w:val="de-DE"/>
+        </w:rPr>
+        <w:t>r markierten Position</w:t>
+      </w:r>
+      <w:r>
+        <w:rPr>
+          <w:lang w:val="de-DE"/>
+        </w:rPr>
+        <w:t xml:space="preserve"> </w:t>
+      </w:r>
+      <w:r>
+        <w:rPr>
+          <w:lang w:val="de-DE"/>
+        </w:rPr>
+        <w:t>angezeigt.</w:t>
+      </w:r>
+      <w:r>
+        <w:rPr>
+          <w:lang w:val="de-DE"/>
+        </w:rPr>
+        <w:t xml:space="preserve"> </w:t>
+      </w:r>
+    </w:p>
+    <w:p>
+      <w:pPr>
+        <w:pStyle w:val="Listenabsatz"/>
+        <w:numPr>
+          <w:ilvl w:val="0"/>
+          <w:numId w:val="1"/>
+        </w:numPr>
+        <w:ind w:left="284" w:hanging="357"/>
+        <w:rPr>
+          <w:lang w:val="de-DE"/>
+        </w:rPr>
+      </w:pPr>
+      <w:r>
+        <w:rPr>
+          <w:lang w:val="de-DE"/>
+        </w:rPr>
+        <w:t xml:space="preserve">Die Anzeige auf dem Controller-Bildschirm zeigt das </w:t>
+      </w:r>
+      <w:r>
+        <w:rPr>
+          <w:lang w:val="de-DE"/>
+        </w:rPr>
+        <w:t>Fahrzeug in der Mitte</w:t>
+      </w:r>
+      <w:r>
+        <w:rPr>
+          <w:lang w:val="de-DE"/>
+        </w:rPr>
+        <w:t xml:space="preserve"> und visualisiert die Vorwärtsrichtung des Fahrzeugs nach oben hin.</w:t>
       </w:r>
     </w:p>
     <w:p>
@@ -398,7 +625,7 @@
           <w:bCs/>
           <w:lang w:val="de-DE"/>
         </w:rPr>
-        <w:t>Controller und</w:t>
+        <w:t>Objekterkennung, Orientierung</w:t>
       </w:r>
       <w:r>
         <w:rPr>
@@ -406,47 +633,7 @@
           <w:bCs/>
           <w:lang w:val="de-DE"/>
         </w:rPr>
-        <w:t xml:space="preserve"> </w:t>
-      </w:r>
-      <w:r>
-        <w:rPr>
-          <w:b/>
-          <w:bCs/>
-          <w:lang w:val="de-DE"/>
-        </w:rPr>
-        <w:t>„</w:t>
-      </w:r>
-      <w:r>
-        <w:rPr>
-          <w:b/>
-          <w:bCs/>
-          <w:lang w:val="de-DE"/>
-        </w:rPr>
-        <w:t>Home</w:t>
-      </w:r>
-      <w:r>
-        <w:rPr>
-          <w:b/>
-          <w:bCs/>
-          <w:lang w:val="de-DE"/>
-        </w:rPr>
-        <w:t>“</w:t>
-      </w:r>
-      <w:r>
-        <w:rPr>
-          <w:b/>
-          <w:bCs/>
-          <w:lang w:val="de-DE"/>
-        </w:rPr>
-        <w:t>-Funktion</w:t>
-      </w:r>
-      <w:r>
-        <w:rPr>
-          <w:b/>
-          <w:bCs/>
-          <w:lang w:val="de-DE"/>
-        </w:rPr>
-        <w:t>:</w:t>
+        <w:t xml:space="preserve"> und Anzeige:</w:t>
       </w:r>
     </w:p>
     <w:p>
@@ -465,339 +652,43 @@
         <w:rPr>
           <w:lang w:val="de-DE"/>
         </w:rPr>
-        <w:t xml:space="preserve">Der Controller ist mit </w:t>
-      </w:r>
-      <w:r>
-        <w:rPr>
-          <w:lang w:val="de-DE"/>
-        </w:rPr>
-        <w:t xml:space="preserve">Folgendem </w:t>
-      </w:r>
-      <w:r>
-        <w:rPr>
-          <w:lang w:val="de-DE"/>
-        </w:rPr>
-        <w:t>ausgestattet</w:t>
-      </w:r>
-      <w:r>
-        <w:rPr>
-          <w:lang w:val="de-DE"/>
-        </w:rPr>
-        <w:t>:</w:t>
-      </w:r>
-    </w:p>
-    <w:p>
-      <w:pPr>
-        <w:pStyle w:val="Listenabsatz"/>
-        <w:numPr>
-          <w:ilvl w:val="1"/>
-          <w:numId w:val="1"/>
-        </w:numPr>
-        <w:rPr>
-          <w:lang w:val="de-DE"/>
-        </w:rPr>
-      </w:pPr>
-      <w:r>
-        <w:rPr>
-          <w:lang w:val="de-DE"/>
-        </w:rPr>
-        <w:t>Arduino</w:t>
-      </w:r>
-    </w:p>
-    <w:p>
-      <w:pPr>
-        <w:pStyle w:val="Listenabsatz"/>
-        <w:numPr>
-          <w:ilvl w:val="1"/>
-          <w:numId w:val="1"/>
-        </w:numPr>
-        <w:rPr>
-          <w:lang w:val="de-DE"/>
-        </w:rPr>
-      </w:pPr>
-      <w:r>
-        <w:rPr>
-          <w:lang w:val="de-DE"/>
-        </w:rPr>
-        <w:t xml:space="preserve">Joystick </w:t>
-      </w:r>
-      <w:r>
-        <w:rPr>
-          <w:sz w:val="20"/>
-          <w:szCs w:val="20"/>
-          <w:lang w:val="de-DE"/>
-        </w:rPr>
-        <w:t>(</w:t>
-      </w:r>
-      <w:r>
-        <w:rPr>
-          <w:sz w:val="20"/>
-          <w:szCs w:val="20"/>
-          <w:lang w:val="de-DE"/>
-        </w:rPr>
-        <w:t>zur Navigation des Fahrzeugs</w:t>
-      </w:r>
-      <w:r>
-        <w:rPr>
-          <w:sz w:val="20"/>
-          <w:szCs w:val="20"/>
-          <w:lang w:val="de-DE"/>
-        </w:rPr>
-        <w:t>)</w:t>
-      </w:r>
-    </w:p>
-    <w:p>
-      <w:pPr>
-        <w:pStyle w:val="Listenabsatz"/>
-        <w:numPr>
-          <w:ilvl w:val="1"/>
-          <w:numId w:val="1"/>
-        </w:numPr>
-        <w:rPr>
-          <w:lang w:val="de-DE"/>
-        </w:rPr>
-      </w:pPr>
-      <w:r>
-        <w:rPr>
-          <w:lang w:val="de-DE"/>
-        </w:rPr>
-        <w:t>„Set-Home“-Taste</w:t>
-      </w:r>
-      <w:r>
-        <w:rPr>
-          <w:lang w:val="de-DE"/>
-        </w:rPr>
-        <w:t xml:space="preserve"> </w:t>
-      </w:r>
-      <w:r>
-        <w:rPr>
-          <w:sz w:val="20"/>
-          <w:szCs w:val="20"/>
-          <w:lang w:val="de-DE"/>
-        </w:rPr>
-        <w:t>(</w:t>
-      </w:r>
-      <w:r>
-        <w:rPr>
-          <w:sz w:val="20"/>
-          <w:szCs w:val="20"/>
-          <w:lang w:val="de-DE"/>
-        </w:rPr>
-        <w:t>zum Speichern von „Home“</w:t>
-      </w:r>
-      <w:r>
-        <w:rPr>
-          <w:sz w:val="20"/>
-          <w:szCs w:val="20"/>
-          <w:lang w:val="de-DE"/>
-        </w:rPr>
-        <w:t>)</w:t>
-      </w:r>
-    </w:p>
-    <w:p>
-      <w:pPr>
-        <w:pStyle w:val="Listenabsatz"/>
-        <w:numPr>
-          <w:ilvl w:val="1"/>
-          <w:numId w:val="1"/>
-        </w:numPr>
-        <w:rPr>
-          <w:lang w:val="de-DE"/>
-        </w:rPr>
-      </w:pPr>
-      <w:r>
-        <w:rPr>
-          <w:lang w:val="de-DE"/>
-        </w:rPr>
-        <w:t>„Return-Home“-Taste</w:t>
-      </w:r>
-      <w:r>
-        <w:rPr>
-          <w:lang w:val="de-DE"/>
-        </w:rPr>
-        <w:t xml:space="preserve"> </w:t>
-      </w:r>
-      <w:r>
-        <w:rPr>
-          <w:sz w:val="20"/>
-          <w:szCs w:val="20"/>
-          <w:lang w:val="de-DE"/>
-        </w:rPr>
-        <w:t>(</w:t>
-      </w:r>
-      <w:r>
-        <w:rPr>
-          <w:sz w:val="20"/>
-          <w:szCs w:val="20"/>
-          <w:lang w:val="de-DE"/>
-        </w:rPr>
-        <w:t>zum Zurückfinden zu „Home“</w:t>
-      </w:r>
-      <w:r>
-        <w:rPr>
-          <w:sz w:val="20"/>
-          <w:szCs w:val="20"/>
-          <w:lang w:val="de-DE"/>
-        </w:rPr>
-        <w:t>)</w:t>
-      </w:r>
-    </w:p>
-    <w:p>
-      <w:pPr>
-        <w:pStyle w:val="Listenabsatz"/>
-        <w:numPr>
-          <w:ilvl w:val="1"/>
-          <w:numId w:val="1"/>
-        </w:numPr>
-        <w:rPr>
-          <w:lang w:val="de-DE"/>
-        </w:rPr>
-      </w:pPr>
-      <w:r>
-        <w:rPr>
-          <w:lang w:val="de-DE"/>
-        </w:rPr>
-        <w:t>L</w:t>
-      </w:r>
-      <w:r>
-        <w:rPr>
-          <w:lang w:val="de-DE"/>
-        </w:rPr>
-        <w:t>E</w:t>
-      </w:r>
-      <w:r>
-        <w:rPr>
-          <w:lang w:val="de-DE"/>
-        </w:rPr>
-        <w:t>D-Bildschirm</w:t>
-      </w:r>
-    </w:p>
-    <w:p>
-      <w:pPr>
-        <w:pStyle w:val="Listenabsatz"/>
-        <w:numPr>
-          <w:ilvl w:val="0"/>
-          <w:numId w:val="1"/>
-        </w:numPr>
-        <w:ind w:left="284" w:hanging="357"/>
-        <w:rPr>
-          <w:lang w:val="de-DE"/>
-        </w:rPr>
-      </w:pPr>
-      <w:r>
-        <w:rPr>
-          <w:lang w:val="de-DE"/>
-        </w:rPr>
-        <w:t>Während des Rückkehrvorgangs</w:t>
-      </w:r>
-      <w:r>
-        <w:rPr>
-          <w:lang w:val="de-DE"/>
-        </w:rPr>
-        <w:t xml:space="preserve"> („Return-Home“)</w:t>
-      </w:r>
-      <w:r>
-        <w:rPr>
-          <w:lang w:val="de-DE"/>
-        </w:rPr>
-        <w:t xml:space="preserve"> wird auf dem Controller-Bildschirm die </w:t>
-      </w:r>
-      <w:r>
-        <w:rPr>
-          <w:u w:val="single"/>
-          <w:lang w:val="de-DE"/>
-        </w:rPr>
-        <w:t xml:space="preserve">Fahrtrichtung zum </w:t>
-      </w:r>
-      <w:r>
-        <w:rPr>
-          <w:u w:val="single"/>
-          <w:lang w:val="de-DE"/>
-        </w:rPr>
-        <w:t>„</w:t>
-      </w:r>
-      <w:r>
-        <w:rPr>
-          <w:u w:val="single"/>
-          <w:lang w:val="de-DE"/>
-        </w:rPr>
-        <w:t>Home</w:t>
-      </w:r>
-      <w:r>
-        <w:rPr>
-          <w:u w:val="single"/>
-          <w:lang w:val="de-DE"/>
-        </w:rPr>
-        <w:t>“</w:t>
-      </w:r>
-      <w:r>
-        <w:rPr>
-          <w:lang w:val="de-DE"/>
-        </w:rPr>
-        <w:t xml:space="preserve"> angezeigt.</w:t>
-      </w:r>
-      <w:r>
-        <w:rPr>
-          <w:lang w:val="de-DE"/>
-        </w:rPr>
-        <w:t xml:space="preserve"> </w:t>
-      </w:r>
-    </w:p>
-    <w:p>
-      <w:pPr>
-        <w:pStyle w:val="Listenabsatz"/>
-        <w:numPr>
-          <w:ilvl w:val="0"/>
-          <w:numId w:val="1"/>
-        </w:numPr>
-        <w:ind w:left="284" w:hanging="357"/>
-        <w:rPr>
-          <w:lang w:val="de-DE"/>
-        </w:rPr>
-      </w:pPr>
-      <w:r>
-        <w:rPr>
-          <w:lang w:val="de-DE"/>
-        </w:rPr>
-        <w:t xml:space="preserve">Die Anzeige auf dem Controller-Bildschirm zeigt das </w:t>
-      </w:r>
-      <w:r>
-        <w:rPr>
-          <w:u w:val="single"/>
-          <w:lang w:val="de-DE"/>
-        </w:rPr>
-        <w:t>Fahrzeug in der Mitte</w:t>
-      </w:r>
-      <w:r>
-        <w:rPr>
-          <w:lang w:val="de-DE"/>
-        </w:rPr>
-        <w:t xml:space="preserve"> und visualisiert die Vorwärtsrichtung des Fahrzeugs nach oben hin.</w:t>
-      </w:r>
-    </w:p>
-    <w:p>
-      <w:pPr>
-        <w:rPr>
-          <w:b/>
-          <w:bCs/>
-          <w:lang w:val="de-DE"/>
-        </w:rPr>
-      </w:pPr>
-      <w:r>
-        <w:rPr>
-          <w:b/>
-          <w:bCs/>
-          <w:lang w:val="de-DE"/>
-        </w:rPr>
-        <w:t>Objekterkennung, Orientierung</w:t>
-      </w:r>
-      <w:r>
-        <w:rPr>
-          <w:b/>
-          <w:bCs/>
-          <w:lang w:val="de-DE"/>
-        </w:rPr>
-        <w:t xml:space="preserve"> und Anzeige:</w:t>
+        <w:t xml:space="preserve">Informationen </w:t>
+      </w:r>
+      <w:r>
+        <w:rPr>
+          <w:lang w:val="de-DE"/>
+        </w:rPr>
+        <w:t>des Sensors</w:t>
+      </w:r>
+      <w:r>
+        <w:rPr>
+          <w:lang w:val="de-DE"/>
+        </w:rPr>
+        <w:t xml:space="preserve"> des Fahrzeugs </w:t>
+      </w:r>
+      <w:r>
+        <w:rPr>
+          <w:lang w:val="de-DE"/>
+        </w:rPr>
+        <w:t>wird</w:t>
+      </w:r>
+      <w:r>
+        <w:rPr>
+          <w:lang w:val="de-DE"/>
+        </w:rPr>
+        <w:t xml:space="preserve"> an den Controller gesendet und </w:t>
+      </w:r>
+      <w:r>
+        <w:rPr>
+          <w:lang w:val="de-DE"/>
+        </w:rPr>
+        <w:t xml:space="preserve">auf dem </w:t>
+      </w:r>
+      <w:r>
+        <w:rPr>
+          <w:lang w:val="de-DE"/>
+        </w:rPr>
+        <w:t>Bildschirm angezeigt.</w:t>
       </w:r>
     </w:p>
     <w:p>
@@ -816,70 +707,13 @@
         <w:rPr>
           <w:lang w:val="de-DE"/>
         </w:rPr>
-        <w:t xml:space="preserve">Die Position des Fahrzeugs wird durch die Orientierung anhand der </w:t>
-      </w:r>
-      <w:r>
-        <w:rPr>
-          <w:u w:val="single"/>
-          <w:lang w:val="de-DE"/>
-        </w:rPr>
-        <w:t>Bewegung des Fahrzeugs</w:t>
-      </w:r>
-      <w:r>
-        <w:rPr>
-          <w:lang w:val="de-DE"/>
-        </w:rPr>
-        <w:t xml:space="preserve"> und der </w:t>
-      </w:r>
-      <w:r>
-        <w:rPr>
-          <w:u w:val="single"/>
-          <w:lang w:val="de-DE"/>
-        </w:rPr>
-        <w:t>Umgebung</w:t>
-      </w:r>
-      <w:r>
-        <w:rPr>
-          <w:lang w:val="de-DE"/>
-        </w:rPr>
-        <w:t xml:space="preserve"> </w:t>
-      </w:r>
-      <w:r>
-        <w:rPr>
-          <w:lang w:val="de-DE"/>
-        </w:rPr>
-        <w:t xml:space="preserve">erfasst und </w:t>
-      </w:r>
-      <w:r>
-        <w:rPr>
-          <w:lang w:val="de-DE"/>
-        </w:rPr>
-        <w:t>gemerkt</w:t>
-      </w:r>
-      <w:r>
-        <w:rPr>
-          <w:lang w:val="de-DE"/>
-        </w:rPr>
-        <w:t>.</w:t>
-      </w:r>
-    </w:p>
-    <w:p>
-      <w:pPr>
-        <w:pStyle w:val="Listenabsatz"/>
-        <w:numPr>
-          <w:ilvl w:val="0"/>
-          <w:numId w:val="1"/>
-        </w:numPr>
-        <w:ind w:left="284"/>
-        <w:rPr>
-          <w:lang w:val="de-DE"/>
-        </w:rPr>
-      </w:pPr>
-      <w:r>
-        <w:rPr>
-          <w:lang w:val="de-DE"/>
-        </w:rPr>
-        <w:t xml:space="preserve">Gespeicherte Position </w:t>
+        <w:t>Markierte</w:t>
+      </w:r>
+      <w:r>
+        <w:rPr>
+          <w:lang w:val="de-DE"/>
+        </w:rPr>
+        <w:t xml:space="preserve"> Position </w:t>
       </w:r>
       <w:r>
         <w:rPr>
@@ -891,88 +725,7 @@
         <w:rPr>
           <w:lang w:val="de-DE"/>
         </w:rPr>
-        <w:t xml:space="preserve"> als Punkt in anderer Farbe auf dem Display angezeigt und bleib</w:t>
-      </w:r>
-      <w:r>
-        <w:rPr>
-          <w:lang w:val="de-DE"/>
-        </w:rPr>
-        <w:t xml:space="preserve">t möglichst </w:t>
-      </w:r>
-      <w:r>
-        <w:rPr>
-          <w:lang w:val="de-DE"/>
-        </w:rPr>
-        <w:t>präzise im Raum, selbst wenn sie außerhalb der aktuellen Kamera</w:t>
-      </w:r>
-      <w:r>
-        <w:rPr>
-          <w:lang w:val="de-DE"/>
-        </w:rPr>
-        <w:t>sicht</w:t>
-      </w:r>
-      <w:r>
-        <w:rPr>
-          <w:lang w:val="de-DE"/>
-        </w:rPr>
-        <w:t xml:space="preserve"> liegen.</w:t>
-      </w:r>
-      <w:r>
-        <w:rPr>
-          <w:lang w:val="de-DE"/>
-        </w:rPr>
-        <w:t xml:space="preserve"> </w:t>
-      </w:r>
-      <w:r>
-        <w:rPr>
-          <w:sz w:val="18"/>
-          <w:szCs w:val="18"/>
-          <w:lang w:val="de-DE"/>
-        </w:rPr>
-        <w:t>(Deshalb sollte der Roboter bei auffälligen Umgebungsänderungen, die nicht durch die Bewegung des Fahrzeugs zu Stande kommen, diese ignorieren)</w:t>
-      </w:r>
-    </w:p>
-    <w:p>
-      <w:pPr>
-        <w:pStyle w:val="Listenabsatz"/>
-        <w:numPr>
-          <w:ilvl w:val="0"/>
-          <w:numId w:val="1"/>
-        </w:numPr>
-        <w:ind w:left="284"/>
-        <w:rPr>
-          <w:lang w:val="de-DE"/>
-        </w:rPr>
-      </w:pPr>
-      <w:r>
-        <w:rPr>
-          <w:lang w:val="de-DE"/>
-        </w:rPr>
-        <w:t xml:space="preserve">Informationen </w:t>
-      </w:r>
-      <w:r>
-        <w:rPr>
-          <w:lang w:val="de-DE"/>
-        </w:rPr>
-        <w:t>der Sensoren</w:t>
-      </w:r>
-      <w:r>
-        <w:rPr>
-          <w:lang w:val="de-DE"/>
-        </w:rPr>
-        <w:t xml:space="preserve"> des Fahrzeugs werden an den Controller gesendet und </w:t>
-      </w:r>
-      <w:r>
-        <w:rPr>
-          <w:lang w:val="de-DE"/>
-        </w:rPr>
-        <w:t xml:space="preserve">auf dem </w:t>
-      </w:r>
-      <w:r>
-        <w:rPr>
-          <w:lang w:val="de-DE"/>
-        </w:rPr>
-        <w:t>Bildschirm angezeigt.</w:t>
+        <w:t xml:space="preserve"> als Punkt in anderer Farbe auf dem Display angezeigt.</w:t>
       </w:r>
     </w:p>
     <w:p>
@@ -1085,7 +838,7 @@
 </file>
 
 <file path=word/endnotes.xml><?xml version="1.0" encoding="utf-8"?>
-<w:endnotes xmlns:wpc="http://schemas.microsoft.com/office/word/2010/wordprocessingCanvas" xmlns:cx="http://schemas.microsoft.com/office/drawing/2014/chartex" xmlns:cx1="http://schemas.microsoft.com/office/drawing/2015/9/8/chartex" xmlns:cx2="http://schemas.microsoft.com/office/drawing/2015/10/21/chartex" xmlns:cx3="http://schemas.microsoft.com/office/drawing/2016/5/9/chartex" xmlns:cx4="http://schemas.microsoft.com/office/drawing/2016/5/10/chartex" xmlns:cx5="http://schemas.microsoft.com/office/drawing/2016/5/11/chartex" xmlns:cx6="http://schemas.microsoft.com/office/drawing/2016/5/12/chartex" xmlns:cx7="http://schemas.microsoft.com/office/drawing/2016/5/13/chartex" xmlns:cx8="http://schemas.microsoft.com/office/drawing/2016/5/14/chartex" xmlns:mc="http://schemas.openxmlformats.org/markup-compatibility/2006" xmlns:aink="http://schemas.microsoft.com/office/drawing/2016/ink" xmlns:am3d="http://schemas.microsoft.com/office/drawing/2017/model3d" xmlns:o="urn:schemas-microsoft-com:office:office" xmlns:oel="http://schemas.microsoft.com/office/2019/extlst" xmlns:r="http://schemas.openxmlformats.org/officeDocument/2006/relationships" xmlns:m="http://schemas.openxmlformats.org/officeDocument/2006/math" xmlns:v="urn:schemas-microsoft-com:vml" xmlns:wp14="http://schemas.microsoft.com/office/word/2010/wordprocessingDrawing" xmlns:wp="http://schemas.openxmlformats.org/drawingml/2006/wordprocessingDrawing" xmlns:w10="urn:schemas-microsoft-com:office:word" xmlns:w="http://schemas.openxmlformats.org/wordprocessingml/2006/main" xmlns:w14="http://schemas.microsoft.com/office/word/2010/wordml" xmlns:w15="http://schemas.microsoft.com/office/word/2012/wordml" xmlns:w16cex="http://schemas.microsoft.com/office/word/2018/wordml/cex" xmlns:w16cid="http://schemas.microsoft.com/office/word/2016/wordml/cid" xmlns:w16="http://schemas.microsoft.com/office/word/2018/wordml" xmlns:w16sdtdh="http://schemas.microsoft.com/office/word/2020/wordml/sdtdatahash" xmlns:w16se="http://schemas.microsoft.com/office/word/2015/wordml/symex" xmlns:wpg="http://schemas.microsoft.com/office/word/2010/wordprocessingGroup" xmlns:wpi="http://schemas.microsoft.com/office/word/2010/wordprocessingInk" xmlns:wne="http://schemas.microsoft.com/office/word/2006/wordml" xmlns:wps="http://schemas.microsoft.com/office/word/2010/wordprocessingShape" mc:Ignorable="w14 w15 w16se w16cid w16 w16cex w16sdtdh wp14">
+<w:endnotes xmlns:wpc="http://schemas.microsoft.com/office/word/2010/wordprocessingCanvas" xmlns:cx="http://schemas.microsoft.com/office/drawing/2014/chartex" xmlns:cx1="http://schemas.microsoft.com/office/drawing/2015/9/8/chartex" xmlns:cx2="http://schemas.microsoft.com/office/drawing/2015/10/21/chartex" xmlns:cx3="http://schemas.microsoft.com/office/drawing/2016/5/9/chartex" xmlns:cx4="http://schemas.microsoft.com/office/drawing/2016/5/10/chartex" xmlns:cx5="http://schemas.microsoft.com/office/drawing/2016/5/11/chartex" xmlns:cx6="http://schemas.microsoft.com/office/drawing/2016/5/12/chartex" xmlns:cx7="http://schemas.microsoft.com/office/drawing/2016/5/13/chartex" xmlns:cx8="http://schemas.microsoft.com/office/drawing/2016/5/14/chartex" xmlns:mc="http://schemas.openxmlformats.org/markup-compatibility/2006" xmlns:aink="http://schemas.microsoft.com/office/drawing/2016/ink" xmlns:am3d="http://schemas.microsoft.com/office/drawing/2017/model3d" xmlns:o="urn:schemas-microsoft-com:office:office" xmlns:oel="http://schemas.microsoft.com/office/2019/extlst" xmlns:r="http://schemas.openxmlformats.org/officeDocument/2006/relationships" xmlns:m="http://schemas.openxmlformats.org/officeDocument/2006/math" xmlns:v="urn:schemas-microsoft-com:vml" xmlns:wp14="http://schemas.microsoft.com/office/word/2010/wordprocessingDrawing" xmlns:wp="http://schemas.openxmlformats.org/drawingml/2006/wordprocessingDrawing" xmlns:w10="urn:schemas-microsoft-com:office:word" xmlns:w="http://schemas.openxmlformats.org/wordprocessingml/2006/main" xmlns:w14="http://schemas.microsoft.com/office/word/2010/wordml" xmlns:w15="http://schemas.microsoft.com/office/word/2012/wordml" xmlns:w16cex="http://schemas.microsoft.com/office/word/2018/wordml/cex" xmlns:w16cid="http://schemas.microsoft.com/office/word/2016/wordml/cid" xmlns:w16="http://schemas.microsoft.com/office/word/2018/wordml" xmlns:w16du="http://schemas.microsoft.com/office/word/2023/wordml/word16du" xmlns:w16sdtdh="http://schemas.microsoft.com/office/word/2020/wordml/sdtdatahash" xmlns:w16se="http://schemas.microsoft.com/office/word/2015/wordml/symex" xmlns:wpg="http://schemas.microsoft.com/office/word/2010/wordprocessingGroup" xmlns:wpi="http://schemas.microsoft.com/office/word/2010/wordprocessingInk" xmlns:wne="http://schemas.microsoft.com/office/word/2006/wordml" xmlns:wps="http://schemas.microsoft.com/office/word/2010/wordprocessingShape" mc:Ignorable="w14 w15 w16se w16cid w16 w16cex w16sdtdh w16du wp14">
   <w:endnote w:type="separator" w:id="-1">
     <w:p>
       <w:pPr>
@@ -1110,7 +863,7 @@
 </file>
 
 <file path=word/footnotes.xml><?xml version="1.0" encoding="utf-8"?>
-<w:footnotes xmlns:wpc="http://schemas.microsoft.com/office/word/2010/wordprocessingCanvas" xmlns:cx="http://schemas.microsoft.com/office/drawing/2014/chartex" xmlns:cx1="http://schemas.microsoft.com/office/drawing/2015/9/8/chartex" xmlns:cx2="http://schemas.microsoft.com/office/drawing/2015/10/21/chartex" xmlns:cx3="http://schemas.microsoft.com/office/drawing/2016/5/9/chartex" xmlns:cx4="http://schemas.microsoft.com/office/drawing/2016/5/10/chartex" xmlns:cx5="http://schemas.microsoft.com/office/drawing/2016/5/11/chartex" xmlns:cx6="http://schemas.microsoft.com/office/drawing/2016/5/12/chartex" xmlns:cx7="http://schemas.microsoft.com/office/drawing/2016/5/13/chartex" xmlns:cx8="http://schemas.microsoft.com/office/drawing/2016/5/14/chartex" xmlns:mc="http://schemas.openxmlformats.org/markup-compatibility/2006" xmlns:aink="http://schemas.microsoft.com/office/drawing/2016/ink" xmlns:am3d="http://schemas.microsoft.com/office/drawing/2017/model3d" xmlns:o="urn:schemas-microsoft-com:office:office" xmlns:oel="http://schemas.microsoft.com/office/2019/extlst" xmlns:r="http://schemas.openxmlformats.org/officeDocument/2006/relationships" xmlns:m="http://schemas.openxmlformats.org/officeDocument/2006/math" xmlns:v="urn:schemas-microsoft-com:vml" xmlns:wp14="http://schemas.microsoft.com/office/word/2010/wordprocessingDrawing" xmlns:wp="http://schemas.openxmlformats.org/drawingml/2006/wordprocessingDrawing" xmlns:w10="urn:schemas-microsoft-com:office:word" xmlns:w="http://schemas.openxmlformats.org/wordprocessingml/2006/main" xmlns:w14="http://schemas.microsoft.com/office/word/2010/wordml" xmlns:w15="http://schemas.microsoft.com/office/word/2012/wordml" xmlns:w16cex="http://schemas.microsoft.com/office/word/2018/wordml/cex" xmlns:w16cid="http://schemas.microsoft.com/office/word/2016/wordml/cid" xmlns:w16="http://schemas.microsoft.com/office/word/2018/wordml" xmlns:w16sdtdh="http://schemas.microsoft.com/office/word/2020/wordml/sdtdatahash" xmlns:w16se="http://schemas.microsoft.com/office/word/2015/wordml/symex" xmlns:wpg="http://schemas.microsoft.com/office/word/2010/wordprocessingGroup" xmlns:wpi="http://schemas.microsoft.com/office/word/2010/wordprocessingInk" xmlns:wne="http://schemas.microsoft.com/office/word/2006/wordml" xmlns:wps="http://schemas.microsoft.com/office/word/2010/wordprocessingShape" mc:Ignorable="w14 w15 w16se w16cid w16 w16cex w16sdtdh wp14">
+<w:footnotes xmlns:wpc="http://schemas.microsoft.com/office/word/2010/wordprocessingCanvas" xmlns:cx="http://schemas.microsoft.com/office/drawing/2014/chartex" xmlns:cx1="http://schemas.microsoft.com/office/drawing/2015/9/8/chartex" xmlns:cx2="http://schemas.microsoft.com/office/drawing/2015/10/21/chartex" xmlns:cx3="http://schemas.microsoft.com/office/drawing/2016/5/9/chartex" xmlns:cx4="http://schemas.microsoft.com/office/drawing/2016/5/10/chartex" xmlns:cx5="http://schemas.microsoft.com/office/drawing/2016/5/11/chartex" xmlns:cx6="http://schemas.microsoft.com/office/drawing/2016/5/12/chartex" xmlns:cx7="http://schemas.microsoft.com/office/drawing/2016/5/13/chartex" xmlns:cx8="http://schemas.microsoft.com/office/drawing/2016/5/14/chartex" xmlns:mc="http://schemas.openxmlformats.org/markup-compatibility/2006" xmlns:aink="http://schemas.microsoft.com/office/drawing/2016/ink" xmlns:am3d="http://schemas.microsoft.com/office/drawing/2017/model3d" xmlns:o="urn:schemas-microsoft-com:office:office" xmlns:oel="http://schemas.microsoft.com/office/2019/extlst" xmlns:r="http://schemas.openxmlformats.org/officeDocument/2006/relationships" xmlns:m="http://schemas.openxmlformats.org/officeDocument/2006/math" xmlns:v="urn:schemas-microsoft-com:vml" xmlns:wp14="http://schemas.microsoft.com/office/word/2010/wordprocessingDrawing" xmlns:wp="http://schemas.openxmlformats.org/drawingml/2006/wordprocessingDrawing" xmlns:w10="urn:schemas-microsoft-com:office:word" xmlns:w="http://schemas.openxmlformats.org/wordprocessingml/2006/main" xmlns:w14="http://schemas.microsoft.com/office/word/2010/wordml" xmlns:w15="http://schemas.microsoft.com/office/word/2012/wordml" xmlns:w16cex="http://schemas.microsoft.com/office/word/2018/wordml/cex" xmlns:w16cid="http://schemas.microsoft.com/office/word/2016/wordml/cid" xmlns:w16="http://schemas.microsoft.com/office/word/2018/wordml" xmlns:w16du="http://schemas.microsoft.com/office/word/2023/wordml/word16du" xmlns:w16sdtdh="http://schemas.microsoft.com/office/word/2020/wordml/sdtdatahash" xmlns:w16se="http://schemas.microsoft.com/office/word/2015/wordml/symex" xmlns:wpg="http://schemas.microsoft.com/office/word/2010/wordprocessingGroup" xmlns:wpi="http://schemas.microsoft.com/office/word/2010/wordprocessingInk" xmlns:wne="http://schemas.microsoft.com/office/word/2006/wordml" xmlns:wps="http://schemas.microsoft.com/office/word/2010/wordprocessingShape" mc:Ignorable="w14 w15 w16se w16cid w16 w16cex w16sdtdh w16du wp14">
   <w:footnote w:type="separator" w:id="-1">
     <w:p>
       <w:pPr>
@@ -1135,7 +888,7 @@
 </file>
 
 <file path=word/header1.xml><?xml version="1.0" encoding="utf-8"?>
-<w:hdr xmlns:wpc="http://schemas.microsoft.com/office/word/2010/wordprocessingCanvas" xmlns:cx="http://schemas.microsoft.com/office/drawing/2014/chartex" xmlns:cx1="http://schemas.microsoft.com/office/drawing/2015/9/8/chartex" xmlns:cx2="http://schemas.microsoft.com/office/drawing/2015/10/21/chartex" xmlns:cx3="http://schemas.microsoft.com/office/drawing/2016/5/9/chartex" xmlns:cx4="http://schemas.microsoft.com/office/drawing/2016/5/10/chartex" xmlns:cx5="http://schemas.microsoft.com/office/drawing/2016/5/11/chartex" xmlns:cx6="http://schemas.microsoft.com/office/drawing/2016/5/12/chartex" xmlns:cx7="http://schemas.microsoft.com/office/drawing/2016/5/13/chartex" xmlns:cx8="http://schemas.microsoft.com/office/drawing/2016/5/14/chartex" xmlns:mc="http://schemas.openxmlformats.org/markup-compatibility/2006" xmlns:aink="http://schemas.microsoft.com/office/drawing/2016/ink" xmlns:am3d="http://schemas.microsoft.com/office/drawing/2017/model3d" xmlns:o="urn:schemas-microsoft-com:office:office" xmlns:oel="http://schemas.microsoft.com/office/2019/extlst" xmlns:r="http://schemas.openxmlformats.org/officeDocument/2006/relationships" xmlns:m="http://schemas.openxmlformats.org/officeDocument/2006/math" xmlns:v="urn:schemas-microsoft-com:vml" xmlns:wp14="http://schemas.microsoft.com/office/word/2010/wordprocessingDrawing" xmlns:wp="http://schemas.openxmlformats.org/drawingml/2006/wordprocessingDrawing" xmlns:w10="urn:schemas-microsoft-com:office:word" xmlns:w="http://schemas.openxmlformats.org/wordprocessingml/2006/main" xmlns:w14="http://schemas.microsoft.com/office/word/2010/wordml" xmlns:w15="http://schemas.microsoft.com/office/word/2012/wordml" xmlns:w16cex="http://schemas.microsoft.com/office/word/2018/wordml/cex" xmlns:w16cid="http://schemas.microsoft.com/office/word/2016/wordml/cid" xmlns:w16="http://schemas.microsoft.com/office/word/2018/wordml" xmlns:w16sdtdh="http://schemas.microsoft.com/office/word/2020/wordml/sdtdatahash" xmlns:w16se="http://schemas.microsoft.com/office/word/2015/wordml/symex" xmlns:wpg="http://schemas.microsoft.com/office/word/2010/wordprocessingGroup" xmlns:wpi="http://schemas.microsoft.com/office/word/2010/wordprocessingInk" xmlns:wne="http://schemas.microsoft.com/office/word/2006/wordml" xmlns:wps="http://schemas.microsoft.com/office/word/2010/wordprocessingShape" mc:Ignorable="w14 w15 w16se w16cid w16 w16cex w16sdtdh wp14">
+<w:hdr xmlns:wpc="http://schemas.microsoft.com/office/word/2010/wordprocessingCanvas" xmlns:cx="http://schemas.microsoft.com/office/drawing/2014/chartex" xmlns:cx1="http://schemas.microsoft.com/office/drawing/2015/9/8/chartex" xmlns:cx2="http://schemas.microsoft.com/office/drawing/2015/10/21/chartex" xmlns:cx3="http://schemas.microsoft.com/office/drawing/2016/5/9/chartex" xmlns:cx4="http://schemas.microsoft.com/office/drawing/2016/5/10/chartex" xmlns:cx5="http://schemas.microsoft.com/office/drawing/2016/5/11/chartex" xmlns:cx6="http://schemas.microsoft.com/office/drawing/2016/5/12/chartex" xmlns:cx7="http://schemas.microsoft.com/office/drawing/2016/5/13/chartex" xmlns:cx8="http://schemas.microsoft.com/office/drawing/2016/5/14/chartex" xmlns:mc="http://schemas.openxmlformats.org/markup-compatibility/2006" xmlns:aink="http://schemas.microsoft.com/office/drawing/2016/ink" xmlns:am3d="http://schemas.microsoft.com/office/drawing/2017/model3d" xmlns:o="urn:schemas-microsoft-com:office:office" xmlns:oel="http://schemas.microsoft.com/office/2019/extlst" xmlns:r="http://schemas.openxmlformats.org/officeDocument/2006/relationships" xmlns:m="http://schemas.openxmlformats.org/officeDocument/2006/math" xmlns:v="urn:schemas-microsoft-com:vml" xmlns:wp14="http://schemas.microsoft.com/office/word/2010/wordprocessingDrawing" xmlns:wp="http://schemas.openxmlformats.org/drawingml/2006/wordprocessingDrawing" xmlns:w10="urn:schemas-microsoft-com:office:word" xmlns:w="http://schemas.openxmlformats.org/wordprocessingml/2006/main" xmlns:w14="http://schemas.microsoft.com/office/word/2010/wordml" xmlns:w15="http://schemas.microsoft.com/office/word/2012/wordml" xmlns:w16cex="http://schemas.microsoft.com/office/word/2018/wordml/cex" xmlns:w16cid="http://schemas.microsoft.com/office/word/2016/wordml/cid" xmlns:w16="http://schemas.microsoft.com/office/word/2018/wordml" xmlns:w16du="http://schemas.microsoft.com/office/word/2023/wordml/word16du" xmlns:w16sdtdh="http://schemas.microsoft.com/office/word/2020/wordml/sdtdatahash" xmlns:w16se="http://schemas.microsoft.com/office/word/2015/wordml/symex" xmlns:wpg="http://schemas.microsoft.com/office/word/2010/wordprocessingGroup" xmlns:wpi="http://schemas.microsoft.com/office/word/2010/wordprocessingInk" xmlns:wne="http://schemas.microsoft.com/office/word/2006/wordml" xmlns:wps="http://schemas.microsoft.com/office/word/2010/wordprocessingShape" mc:Ignorable="w14 w15 w16se w16cid w16 w16cex w16sdtdh w16du wp14">
   <w:sdt>
     <w:sdtPr>
       <w:alias w:val="Autor"/>
@@ -1162,7 +915,7 @@
 </file>
 
 <file path=word/numbering.xml><?xml version="1.0" encoding="utf-8"?>
-<w:numbering xmlns:wpc="http://schemas.microsoft.com/office/word/2010/wordprocessingCanvas" xmlns:cx="http://schemas.microsoft.com/office/drawing/2014/chartex" xmlns:cx1="http://schemas.microsoft.com/office/drawing/2015/9/8/chartex" xmlns:cx2="http://schemas.microsoft.com/office/drawing/2015/10/21/chartex" xmlns:cx3="http://schemas.microsoft.com/office/drawing/2016/5/9/chartex" xmlns:cx4="http://schemas.microsoft.com/office/drawing/2016/5/10/chartex" xmlns:cx5="http://schemas.microsoft.com/office/drawing/2016/5/11/chartex" xmlns:cx6="http://schemas.microsoft.com/office/drawing/2016/5/12/chartex" xmlns:cx7="http://schemas.microsoft.com/office/drawing/2016/5/13/chartex" xmlns:cx8="http://schemas.microsoft.com/office/drawing/2016/5/14/chartex" xmlns:mc="http://schemas.openxmlformats.org/markup-compatibility/2006" xmlns:aink="http://schemas.microsoft.com/office/drawing/2016/ink" xmlns:am3d="http://schemas.microsoft.com/office/drawing/2017/model3d" xmlns:o="urn:schemas-microsoft-com:office:office" xmlns:oel="http://schemas.microsoft.com/office/2019/extlst" xmlns:r="http://schemas.openxmlformats.org/officeDocument/2006/relationships" xmlns:m="http://schemas.openxmlformats.org/officeDocument/2006/math" xmlns:v="urn:schemas-microsoft-com:vml" xmlns:wp14="http://schemas.microsoft.com/office/word/2010/wordprocessingDrawing" xmlns:wp="http://schemas.openxmlformats.org/drawingml/2006/wordprocessingDrawing" xmlns:w10="urn:schemas-microsoft-com:office:word" xmlns:w="http://schemas.openxmlformats.org/wordprocessingml/2006/main" xmlns:w14="http://schemas.microsoft.com/office/word/2010/wordml" xmlns:w15="http://schemas.microsoft.com/office/word/2012/wordml" xmlns:w16cex="http://schemas.microsoft.com/office/word/2018/wordml/cex" xmlns:w16cid="http://schemas.microsoft.com/office/word/2016/wordml/cid" xmlns:w16="http://schemas.microsoft.com/office/word/2018/wordml" xmlns:w16sdtdh="http://schemas.microsoft.com/office/word/2020/wordml/sdtdatahash" xmlns:w16se="http://schemas.microsoft.com/office/word/2015/wordml/symex" xmlns:wpg="http://schemas.microsoft.com/office/word/2010/wordprocessingGroup" xmlns:wpi="http://schemas.microsoft.com/office/word/2010/wordprocessingInk" xmlns:wne="http://schemas.microsoft.com/office/word/2006/wordml" xmlns:wps="http://schemas.microsoft.com/office/word/2010/wordprocessingShape" mc:Ignorable="w14 w15 w16se w16cid w16 w16cex w16sdtdh wp14">
+<w:numbering xmlns:wpc="http://schemas.microsoft.com/office/word/2010/wordprocessingCanvas" xmlns:cx="http://schemas.microsoft.com/office/drawing/2014/chartex" xmlns:cx1="http://schemas.microsoft.com/office/drawing/2015/9/8/chartex" xmlns:cx2="http://schemas.microsoft.com/office/drawing/2015/10/21/chartex" xmlns:cx3="http://schemas.microsoft.com/office/drawing/2016/5/9/chartex" xmlns:cx4="http://schemas.microsoft.com/office/drawing/2016/5/10/chartex" xmlns:cx5="http://schemas.microsoft.com/office/drawing/2016/5/11/chartex" xmlns:cx6="http://schemas.microsoft.com/office/drawing/2016/5/12/chartex" xmlns:cx7="http://schemas.microsoft.com/office/drawing/2016/5/13/chartex" xmlns:cx8="http://schemas.microsoft.com/office/drawing/2016/5/14/chartex" xmlns:mc="http://schemas.openxmlformats.org/markup-compatibility/2006" xmlns:aink="http://schemas.microsoft.com/office/drawing/2016/ink" xmlns:am3d="http://schemas.microsoft.com/office/drawing/2017/model3d" xmlns:o="urn:schemas-microsoft-com:office:office" xmlns:oel="http://schemas.microsoft.com/office/2019/extlst" xmlns:r="http://schemas.openxmlformats.org/officeDocument/2006/relationships" xmlns:m="http://schemas.openxmlformats.org/officeDocument/2006/math" xmlns:v="urn:schemas-microsoft-com:vml" xmlns:wp14="http://schemas.microsoft.com/office/word/2010/wordprocessingDrawing" xmlns:wp="http://schemas.openxmlformats.org/drawingml/2006/wordprocessingDrawing" xmlns:w10="urn:schemas-microsoft-com:office:word" xmlns:w="http://schemas.openxmlformats.org/wordprocessingml/2006/main" xmlns:w14="http://schemas.microsoft.com/office/word/2010/wordml" xmlns:w15="http://schemas.microsoft.com/office/word/2012/wordml" xmlns:w16cex="http://schemas.microsoft.com/office/word/2018/wordml/cex" xmlns:w16cid="http://schemas.microsoft.com/office/word/2016/wordml/cid" xmlns:w16="http://schemas.microsoft.com/office/word/2018/wordml" xmlns:w16du="http://schemas.microsoft.com/office/word/2023/wordml/word16du" xmlns:w16sdtdh="http://schemas.microsoft.com/office/word/2020/wordml/sdtdatahash" xmlns:w16se="http://schemas.microsoft.com/office/word/2015/wordml/symex" xmlns:wpg="http://schemas.microsoft.com/office/word/2010/wordprocessingGroup" xmlns:wpi="http://schemas.microsoft.com/office/word/2010/wordprocessingInk" xmlns:wne="http://schemas.microsoft.com/office/word/2006/wordml" xmlns:wps="http://schemas.microsoft.com/office/word/2010/wordprocessingShape" mc:Ignorable="w14 w15 w16se w16cid w16 w16cex w16sdtdh w16du wp14">
   <w:abstractNum w:abstractNumId="0" w15:restartNumberingAfterBreak="0">
     <w:nsid w:val="08EE4BB2"/>
     <w:multiLevelType w:val="hybridMultilevel"/>
@@ -1399,7 +1152,7 @@
 </file>
 
 <file path=word/styles.xml><?xml version="1.0" encoding="utf-8"?>
-<w:styles xmlns:mc="http://schemas.openxmlformats.org/markup-compatibility/2006" xmlns:r="http://schemas.openxmlformats.org/officeDocument/2006/relationships" xmlns:w="http://schemas.openxmlformats.org/wordprocessingml/2006/main" xmlns:w14="http://schemas.microsoft.com/office/word/2010/wordml" xmlns:w15="http://schemas.microsoft.com/office/word/2012/wordml" xmlns:w16cex="http://schemas.microsoft.com/office/word/2018/wordml/cex" xmlns:w16cid="http://schemas.microsoft.com/office/word/2016/wordml/cid" xmlns:w16="http://schemas.microsoft.com/office/word/2018/wordml" xmlns:w16sdtdh="http://schemas.microsoft.com/office/word/2020/wordml/sdtdatahash" xmlns:w16se="http://schemas.microsoft.com/office/word/2015/wordml/symex" mc:Ignorable="w14 w15 w16se w16cid w16 w16cex w16sdtdh">
+<w:styles xmlns:mc="http://schemas.openxmlformats.org/markup-compatibility/2006" xmlns:r="http://schemas.openxmlformats.org/officeDocument/2006/relationships" xmlns:w="http://schemas.openxmlformats.org/wordprocessingml/2006/main" xmlns:w14="http://schemas.microsoft.com/office/word/2010/wordml" xmlns:w15="http://schemas.microsoft.com/office/word/2012/wordml" xmlns:w16cex="http://schemas.microsoft.com/office/word/2018/wordml/cex" xmlns:w16cid="http://schemas.microsoft.com/office/word/2016/wordml/cid" xmlns:w16="http://schemas.microsoft.com/office/word/2018/wordml" xmlns:w16du="http://schemas.microsoft.com/office/word/2023/wordml/word16du" xmlns:w16sdtdh="http://schemas.microsoft.com/office/word/2020/wordml/sdtdatahash" xmlns:w16se="http://schemas.microsoft.com/office/word/2015/wordml/symex" mc:Ignorable="w14 w15 w16se w16cid w16 w16cex w16sdtdh w16du">
   <w:docDefaults>
     <w:rPrDefault>
       <w:rPr>
@@ -1895,7 +1648,7 @@
 </file>
 
 <file path=word/glossary/document.xml><?xml version="1.0" encoding="utf-8"?>
-<w:glossaryDocument xmlns:wpc="http://schemas.microsoft.com/office/word/2010/wordprocessingCanvas" xmlns:cx="http://schemas.microsoft.com/office/drawing/2014/chartex" xmlns:cx1="http://schemas.microsoft.com/office/drawing/2015/9/8/chartex" xmlns:cx2="http://schemas.microsoft.com/office/drawing/2015/10/21/chartex" xmlns:cx3="http://schemas.microsoft.com/office/drawing/2016/5/9/chartex" xmlns:cx4="http://schemas.microsoft.com/office/drawing/2016/5/10/chartex" xmlns:cx5="http://schemas.microsoft.com/office/drawing/2016/5/11/chartex" xmlns:cx6="http://schemas.microsoft.com/office/drawing/2016/5/12/chartex" xmlns:cx7="http://schemas.microsoft.com/office/drawing/2016/5/13/chartex" xmlns:cx8="http://schemas.microsoft.com/office/drawing/2016/5/14/chartex" xmlns:mc="http://schemas.openxmlformats.org/markup-compatibility/2006" xmlns:aink="http://schemas.microsoft.com/office/drawing/2016/ink" xmlns:am3d="http://schemas.microsoft.com/office/drawing/2017/model3d" xmlns:o="urn:schemas-microsoft-com:office:office" xmlns:oel="http://schemas.microsoft.com/office/2019/extlst" xmlns:r="http://schemas.openxmlformats.org/officeDocument/2006/relationships" xmlns:m="http://schemas.openxmlformats.org/officeDocument/2006/math" xmlns:v="urn:schemas-microsoft-com:vml" xmlns:wp14="http://schemas.microsoft.com/office/word/2010/wordprocessingDrawing" xmlns:wp="http://schemas.openxmlformats.org/drawingml/2006/wordprocessingDrawing" xmlns:w10="urn:schemas-microsoft-com:office:word" xmlns:w="http://schemas.openxmlformats.org/wordprocessingml/2006/main" xmlns:w14="http://schemas.microsoft.com/office/word/2010/wordml" xmlns:w15="http://schemas.microsoft.com/office/word/2012/wordml" xmlns:w16cex="http://schemas.microsoft.com/office/word/2018/wordml/cex" xmlns:w16cid="http://schemas.microsoft.com/office/word/2016/wordml/cid" xmlns:w16="http://schemas.microsoft.com/office/word/2018/wordml" xmlns:w16sdtdh="http://schemas.microsoft.com/office/word/2020/wordml/sdtdatahash" xmlns:w16se="http://schemas.microsoft.com/office/word/2015/wordml/symex" xmlns:wpg="http://schemas.microsoft.com/office/word/2010/wordprocessingGroup" xmlns:wpi="http://schemas.microsoft.com/office/word/2010/wordprocessingInk" xmlns:wne="http://schemas.microsoft.com/office/word/2006/wordml" xmlns:wps="http://schemas.microsoft.com/office/word/2010/wordprocessingShape" mc:Ignorable="w14 w15 w16se w16cid w16 w16cex w16sdtdh wp14">
+<w:glossaryDocument xmlns:wpc="http://schemas.microsoft.com/office/word/2010/wordprocessingCanvas" xmlns:cx="http://schemas.microsoft.com/office/drawing/2014/chartex" xmlns:cx1="http://schemas.microsoft.com/office/drawing/2015/9/8/chartex" xmlns:cx2="http://schemas.microsoft.com/office/drawing/2015/10/21/chartex" xmlns:cx3="http://schemas.microsoft.com/office/drawing/2016/5/9/chartex" xmlns:cx4="http://schemas.microsoft.com/office/drawing/2016/5/10/chartex" xmlns:cx5="http://schemas.microsoft.com/office/drawing/2016/5/11/chartex" xmlns:cx6="http://schemas.microsoft.com/office/drawing/2016/5/12/chartex" xmlns:cx7="http://schemas.microsoft.com/office/drawing/2016/5/13/chartex" xmlns:cx8="http://schemas.microsoft.com/office/drawing/2016/5/14/chartex" xmlns:mc="http://schemas.openxmlformats.org/markup-compatibility/2006" xmlns:aink="http://schemas.microsoft.com/office/drawing/2016/ink" xmlns:am3d="http://schemas.microsoft.com/office/drawing/2017/model3d" xmlns:o="urn:schemas-microsoft-com:office:office" xmlns:oel="http://schemas.microsoft.com/office/2019/extlst" xmlns:r="http://schemas.openxmlformats.org/officeDocument/2006/relationships" xmlns:m="http://schemas.openxmlformats.org/officeDocument/2006/math" xmlns:v="urn:schemas-microsoft-com:vml" xmlns:wp14="http://schemas.microsoft.com/office/word/2010/wordprocessingDrawing" xmlns:wp="http://schemas.openxmlformats.org/drawingml/2006/wordprocessingDrawing" xmlns:w10="urn:schemas-microsoft-com:office:word" xmlns:w="http://schemas.openxmlformats.org/wordprocessingml/2006/main" xmlns:w14="http://schemas.microsoft.com/office/word/2010/wordml" xmlns:w15="http://schemas.microsoft.com/office/word/2012/wordml" xmlns:w16cex="http://schemas.microsoft.com/office/word/2018/wordml/cex" xmlns:w16cid="http://schemas.microsoft.com/office/word/2016/wordml/cid" xmlns:w16="http://schemas.microsoft.com/office/word/2018/wordml" xmlns:w16du="http://schemas.microsoft.com/office/word/2023/wordml/word16du" xmlns:w16sdtdh="http://schemas.microsoft.com/office/word/2020/wordml/sdtdatahash" xmlns:w16se="http://schemas.microsoft.com/office/word/2015/wordml/symex" xmlns:wpg="http://schemas.microsoft.com/office/word/2010/wordprocessingGroup" xmlns:wpi="http://schemas.microsoft.com/office/word/2010/wordprocessingInk" xmlns:wne="http://schemas.microsoft.com/office/word/2006/wordml" xmlns:wps="http://schemas.microsoft.com/office/word/2010/wordprocessingShape" mc:Ignorable="w14 w15 w16se w16cid w16 w16cex w16sdtdh w16du wp14">
   <w:docParts>
     <w:docPart>
       <w:docPartPr>
@@ -1928,7 +1681,7 @@
 </file>
 
 <file path=word/glossary/fontTable.xml><?xml version="1.0" encoding="utf-8"?>
-<w:fonts xmlns:mc="http://schemas.openxmlformats.org/markup-compatibility/2006" xmlns:r="http://schemas.openxmlformats.org/officeDocument/2006/relationships" xmlns:w="http://schemas.openxmlformats.org/wordprocessingml/2006/main" xmlns:w14="http://schemas.microsoft.com/office/word/2010/wordml" xmlns:w15="http://schemas.microsoft.com/office/word/2012/wordml" xmlns:w16cex="http://schemas.microsoft.com/office/word/2018/wordml/cex" xmlns:w16cid="http://schemas.microsoft.com/office/word/2016/wordml/cid" xmlns:w16="http://schemas.microsoft.com/office/word/2018/wordml" xmlns:w16sdtdh="http://schemas.microsoft.com/office/word/2020/wordml/sdtdatahash" xmlns:w16se="http://schemas.microsoft.com/office/word/2015/wordml/symex" mc:Ignorable="w14 w15 w16se w16cid w16 w16cex w16sdtdh">
+<w:fonts xmlns:mc="http://schemas.openxmlformats.org/markup-compatibility/2006" xmlns:r="http://schemas.openxmlformats.org/officeDocument/2006/relationships" xmlns:w="http://schemas.openxmlformats.org/wordprocessingml/2006/main" xmlns:w14="http://schemas.microsoft.com/office/word/2010/wordml" xmlns:w15="http://schemas.microsoft.com/office/word/2012/wordml" xmlns:w16cex="http://schemas.microsoft.com/office/word/2018/wordml/cex" xmlns:w16cid="http://schemas.microsoft.com/office/word/2016/wordml/cid" xmlns:w16="http://schemas.microsoft.com/office/word/2018/wordml" xmlns:w16du="http://schemas.microsoft.com/office/word/2023/wordml/word16du" xmlns:w16sdtdh="http://schemas.microsoft.com/office/word/2020/wordml/sdtdatahash" xmlns:w16se="http://schemas.microsoft.com/office/word/2015/wordml/symex" mc:Ignorable="w14 w15 w16se w16cid w16 w16cex w16sdtdh w16du">
   <w:font w:name="Symbol">
     <w:panose1 w:val="05050102010706020507"/>
     <w:charset w:val="02"/>
@@ -1962,20 +1715,32 @@
     <w:charset w:val="00"/>
     <w:family w:val="swiss"/>
     <w:pitch w:val="variable"/>
-    <w:sig w:usb0="E4002EFF" w:usb1="C000247B" w:usb2="00000009" w:usb3="00000000" w:csb0="000001FF" w:csb1="00000000"/>
+    <w:sig w:usb0="E4002EFF" w:usb1="C200247B" w:usb2="00000009" w:usb3="00000000" w:csb0="000001FF" w:csb1="00000000"/>
   </w:font>
   <w:font w:name="Calibri Light">
     <w:panose1 w:val="020F0302020204030204"/>
     <w:charset w:val="00"/>
     <w:family w:val="swiss"/>
     <w:pitch w:val="variable"/>
-    <w:sig w:usb0="E4002EFF" w:usb1="C000247B" w:usb2="00000009" w:usb3="00000000" w:csb0="000001FF" w:csb1="00000000"/>
+    <w:sig w:usb0="E4002EFF" w:usb1="C200247B" w:usb2="00000009" w:usb3="00000000" w:csb0="000001FF" w:csb1="00000000"/>
+  </w:font>
+  <w:font w:name="Aptos">
+    <w:charset w:val="00"/>
+    <w:family w:val="swiss"/>
+    <w:pitch w:val="variable"/>
+    <w:sig w:usb0="20000287" w:usb1="00000003" w:usb2="00000000" w:usb3="00000000" w:csb0="0000019F" w:csb1="00000000"/>
+  </w:font>
+  <w:font w:name="Aptos Display">
+    <w:charset w:val="00"/>
+    <w:family w:val="swiss"/>
+    <w:pitch w:val="variable"/>
+    <w:sig w:usb0="20000287" w:usb1="00000003" w:usb2="00000000" w:usb3="00000000" w:csb0="0000019F" w:csb1="00000000"/>
   </w:font>
 </w:fonts>
 </file>
 
 <file path=word/glossary/settings.xml><?xml version="1.0" encoding="utf-8"?>
-<w:settings xmlns:mc="http://schemas.openxmlformats.org/markup-compatibility/2006" xmlns:o="urn:schemas-microsoft-com:office:office" xmlns:r="http://schemas.openxmlformats.org/officeDocument/2006/relationships" xmlns:m="http://schemas.openxmlformats.org/officeDocument/2006/math" xmlns:v="urn:schemas-microsoft-com:vml" xmlns:w10="urn:schemas-microsoft-com:office:word" xmlns:w="http://schemas.openxmlformats.org/wordprocessingml/2006/main" xmlns:w14="http://schemas.microsoft.com/office/word/2010/wordml" xmlns:w15="http://schemas.microsoft.com/office/word/2012/wordml" xmlns:w16cex="http://schemas.microsoft.com/office/word/2018/wordml/cex" xmlns:w16cid="http://schemas.microsoft.com/office/word/2016/wordml/cid" xmlns:w16="http://schemas.microsoft.com/office/word/2018/wordml" xmlns:w16sdtdh="http://schemas.microsoft.com/office/word/2020/wordml/sdtdatahash" xmlns:w16se="http://schemas.microsoft.com/office/word/2015/wordml/symex" xmlns:sl="http://schemas.openxmlformats.org/schemaLibrary/2006/main" mc:Ignorable="w14 w15 w16se w16cid w16 w16cex w16sdtdh">
+<w:settings xmlns:mc="http://schemas.openxmlformats.org/markup-compatibility/2006" xmlns:o="urn:schemas-microsoft-com:office:office" xmlns:r="http://schemas.openxmlformats.org/officeDocument/2006/relationships" xmlns:m="http://schemas.openxmlformats.org/officeDocument/2006/math" xmlns:v="urn:schemas-microsoft-com:vml" xmlns:w10="urn:schemas-microsoft-com:office:word" xmlns:w="http://schemas.openxmlformats.org/wordprocessingml/2006/main" xmlns:w14="http://schemas.microsoft.com/office/word/2010/wordml" xmlns:w15="http://schemas.microsoft.com/office/word/2012/wordml" xmlns:w16cex="http://schemas.microsoft.com/office/word/2018/wordml/cex" xmlns:w16cid="http://schemas.microsoft.com/office/word/2016/wordml/cid" xmlns:w16="http://schemas.microsoft.com/office/word/2018/wordml" xmlns:w16du="http://schemas.microsoft.com/office/word/2023/wordml/word16du" xmlns:w16sdtdh="http://schemas.microsoft.com/office/word/2020/wordml/sdtdatahash" xmlns:w16se="http://schemas.microsoft.com/office/word/2015/wordml/symex" xmlns:sl="http://schemas.openxmlformats.org/schemaLibrary/2006/main" mc:Ignorable="w14 w15 w16se w16cid w16 w16cex w16sdtdh w16du">
   <w:view w:val="normal"/>
   <w:defaultTabStop w:val="708"/>
   <w:hyphenationZone w:val="425"/>
@@ -1994,6 +1759,7 @@
     <w:rsid w:val="0003287A"/>
     <w:rsid w:val="00077ABC"/>
     <w:rsid w:val="000C2E6E"/>
+    <w:rsid w:val="001E4119"/>
     <w:rsid w:val="005264A7"/>
     <w:rsid w:val="00BE7DA0"/>
   </w:rsids>
@@ -2019,7 +1785,7 @@
 </file>
 
 <file path=word/glossary/styles.xml><?xml version="1.0" encoding="utf-8"?>
-<w:styles xmlns:mc="http://schemas.openxmlformats.org/markup-compatibility/2006" xmlns:r="http://schemas.openxmlformats.org/officeDocument/2006/relationships" xmlns:w="http://schemas.openxmlformats.org/wordprocessingml/2006/main" xmlns:w14="http://schemas.microsoft.com/office/word/2010/wordml" xmlns:w15="http://schemas.microsoft.com/office/word/2012/wordml" xmlns:w16cex="http://schemas.microsoft.com/office/word/2018/wordml/cex" xmlns:w16cid="http://schemas.microsoft.com/office/word/2016/wordml/cid" xmlns:w16="http://schemas.microsoft.com/office/word/2018/wordml" xmlns:w16sdtdh="http://schemas.microsoft.com/office/word/2020/wordml/sdtdatahash" xmlns:w16se="http://schemas.microsoft.com/office/word/2015/wordml/symex" mc:Ignorable="w14 w15 w16se w16cid w16 w16cex w16sdtdh">
+<w:styles xmlns:mc="http://schemas.openxmlformats.org/markup-compatibility/2006" xmlns:r="http://schemas.openxmlformats.org/officeDocument/2006/relationships" xmlns:w="http://schemas.openxmlformats.org/wordprocessingml/2006/main" xmlns:w14="http://schemas.microsoft.com/office/word/2010/wordml" xmlns:w15="http://schemas.microsoft.com/office/word/2012/wordml" xmlns:w16cex="http://schemas.microsoft.com/office/word/2018/wordml/cex" xmlns:w16cid="http://schemas.microsoft.com/office/word/2016/wordml/cid" xmlns:w16="http://schemas.microsoft.com/office/word/2018/wordml" xmlns:w16du="http://schemas.microsoft.com/office/word/2023/wordml/word16du" xmlns:w16sdtdh="http://schemas.microsoft.com/office/word/2020/wordml/sdtdatahash" xmlns:w16se="http://schemas.microsoft.com/office/word/2015/wordml/symex" mc:Ignorable="w14 w15 w16se w16cid w16 w16cex w16sdtdh w16du">
   <w:docDefaults>
     <w:rPrDefault>
       <w:rPr>
@@ -2466,7 +2232,7 @@
 </file>
 
 <file path=word/glossary/webSettings.xml><?xml version="1.0" encoding="utf-8"?>
-<w:webSettings xmlns:mc="http://schemas.openxmlformats.org/markup-compatibility/2006" xmlns:r="http://schemas.openxmlformats.org/officeDocument/2006/relationships" xmlns:w="http://schemas.openxmlformats.org/wordprocessingml/2006/main" xmlns:w14="http://schemas.microsoft.com/office/word/2010/wordml" xmlns:w15="http://schemas.microsoft.com/office/word/2012/wordml" xmlns:w16cex="http://schemas.microsoft.com/office/word/2018/wordml/cex" xmlns:w16cid="http://schemas.microsoft.com/office/word/2016/wordml/cid" xmlns:w16="http://schemas.microsoft.com/office/word/2018/wordml" xmlns:w16sdtdh="http://schemas.microsoft.com/office/word/2020/wordml/sdtdatahash" xmlns:w16se="http://schemas.microsoft.com/office/word/2015/wordml/symex" mc:Ignorable="w14 w15 w16se w16cid w16 w16cex w16sdtdh">
+<w:webSettings xmlns:mc="http://schemas.openxmlformats.org/markup-compatibility/2006" xmlns:r="http://schemas.openxmlformats.org/officeDocument/2006/relationships" xmlns:w="http://schemas.openxmlformats.org/wordprocessingml/2006/main" xmlns:w14="http://schemas.microsoft.com/office/word/2010/wordml" xmlns:w15="http://schemas.microsoft.com/office/word/2012/wordml" xmlns:w16cex="http://schemas.microsoft.com/office/word/2018/wordml/cex" xmlns:w16cid="http://schemas.microsoft.com/office/word/2016/wordml/cid" xmlns:w16="http://schemas.microsoft.com/office/word/2018/wordml" xmlns:w16du="http://schemas.microsoft.com/office/word/2023/wordml/word16du" xmlns:w16sdtdh="http://schemas.microsoft.com/office/word/2020/wordml/sdtdatahash" xmlns:w16se="http://schemas.microsoft.com/office/word/2015/wordml/symex" mc:Ignorable="w14 w15 w16se w16cid w16 w16cex w16sdtdh w16du">
   <w:optimizeForBrowser/>
   <w:allowPNG/>
 </w:webSettings>

</xml_diff>